<commit_message>
consistency pass: NYISO known refusal no longer a nightly failure; drop refused IL CUB mirror; C-05 and docs brought up to date
Co-Authored-By: Claude Opus 5.5 <noreply@anthropic.com>
Claude-Session: https://claude.ai/code/session_01NwD8Daam3i7DiEPPbN7b9E
</commit_message>
<xml_diff>
--- a/docs/GRID_DOCKET_CONTEXT.docx
+++ b/docs/GRID_DOCKET_CONTEXT.docx
@@ -1891,6 +1891,21 @@
               <w:rPr>
                 <w:rStyle w:val="VerbatimChar"/>
               </w:rPr>
+              <w:t xml:space="preserve">adapters3.py</w:t>
+            </w:r>
+            <w:r>
+              <w:t xml:space="preserve"> </w:t>
+            </w:r>
+            <w:r>
+              <w:t xml:space="preserve">(wave 3, 3 Oct: Supreme Court of Texas, local agendas, ERCOT large-load status, NYISO ICAP, NRC ADAMS, FERC Form 1/3-Q/714 and EQR, LBNL via OSTI),</w:t>
+            </w:r>
+            <w:r>
+              <w:t xml:space="preserve"> </w:t>
+            </w:r>
+            <w:r>
+              <w:rPr>
+                <w:rStyle w:val="VerbatimChar"/>
+              </w:rPr>
               <w:t xml:space="preserve">run.py</w:t>
             </w:r>
             <w:r>
@@ -1942,7 +1957,22 @@
               <w:t xml:space="preserve"> </w:t>
             </w:r>
             <w:r>
-              <w:t xml:space="preserve">(repair tools)</w:t>
+              <w:t xml:space="preserve">(repair tools;</w:t>
+            </w:r>
+            <w:r>
+              <w:t xml:space="preserve"> </w:t>
+            </w:r>
+            <w:r>
+              <w:rPr>
+                <w:rStyle w:val="VerbatimChar"/>
+              </w:rPr>
+              <w:t xml:space="preserve">urls:&lt;list&gt;</w:t>
+            </w:r>
+            <w:r>
+              <w:t xml:space="preserve"> </w:t>
+            </w:r>
+            <w:r>
+              <w:t xml:space="preserve">probes candidate URLs from the runners)</w:t>
             </w:r>
           </w:p>
         </w:tc>
@@ -1978,7 +2008,7 @@
               <w:t xml:space="preserve">The single place to add or drop coverage</w:t>
             </w:r>
             <w:r>
-              <w:t xml:space="preserve">: 56 keywords, jurisdictions and routes, watched dockets, entity aliases, party watch list, EDGAR issuers, Federal Register terms, 49+ watch pages, RSS, IR pages, mirrors, queues, Legistar clients, court and Open States queries</w:t>
+              <w:t xml:space="preserve">: 56 keywords, jurisdictions and routes, watched dockets, entity aliases, party watch list, EDGAR issuers, Federal Register terms, 45 watch pages, 13 RSS feeds, 16 IR pages, 5 mirrors, 2 queues, 9 Legistar clients, 7 other agenda lists, court, OSTI and Open States queries, NRC dockets, FERC form filers, EQR counterparties</w:t>
             </w:r>
           </w:p>
         </w:tc>
@@ -7917,7 +7947,22 @@
               <w:t xml:space="preserve"> </w:t>
             </w:r>
             <w:r>
-              <w:t xml:space="preserve">records the refusal and stops. The manual pass reads the ICAP page monthly (extra page).</w:t>
+              <w:t xml:space="preserve">records it as</w:t>
+            </w:r>
+            <w:r>
+              <w:t xml:space="preserve"> </w:t>
+            </w:r>
+            <w:r>
+              <w:rPr>
+                <w:rStyle w:val="VerbatimChar"/>
+              </w:rPr>
+              <w:t xml:space="preserve">refused_known</w:t>
+            </w:r>
+            <w:r>
+              <w:t xml:space="preserve"> </w:t>
+            </w:r>
+            <w:r>
+              <w:t xml:space="preserve">(a sub-source status, so it never trips the circuit breaker or the Brief’s RED) and stops. The manual pass reads the ICAP page monthly (extra page).</w:t>
             </w:r>
           </w:p>
         </w:tc>
@@ -11025,7 +11070,7 @@
               <w:jc w:val="left"/>
             </w:pPr>
             <w:r>
-              <w:t xml:space="preserve">403</w:t>
+              <w:t xml:space="preserve">403 (mirror removed from the watchlist 4 Oct)</w:t>
             </w:r>
           </w:p>
         </w:tc>
@@ -18379,6 +18424,47 @@
             </w:r>
             <w:r>
               <w:t xml:space="preserve">rewritten; §8–§12, §16–§18 updated</w:t>
+            </w:r>
+          </w:p>
+        </w:tc>
+      </w:tr>
+      <w:tr>
+        <w:tc>
+          <w:tcPr/>
+          <w:p>
+            <w:pPr>
+              <w:pStyle w:val="Compact"/>
+              <w:jc w:val="left"/>
+            </w:pPr>
+            <w:r>
+              <w:t xml:space="preserve">2026-10-04 (am)</w:t>
+            </w:r>
+          </w:p>
+        </w:tc>
+        <w:tc>
+          <w:tcPr/>
+          <w:p>
+            <w:pPr>
+              <w:pStyle w:val="Compact"/>
+              <w:jc w:val="left"/>
+            </w:pPr>
+            <w:r>
+              <w:t xml:space="preserve">Consistency pass: NYISO ICAP refusal recorded as</w:t>
+            </w:r>
+            <w:r>
+              <w:t xml:space="preserve"> </w:t>
+            </w:r>
+            <w:r>
+              <w:rPr>
+                <w:rStyle w:val="VerbatimChar"/>
+              </w:rPr>
+              <w:t xml:space="preserve">refused_known</w:t>
+            </w:r>
+            <w:r>
+              <w:t xml:space="preserve"> </w:t>
+            </w:r>
+            <w:r>
+              <w:t xml:space="preserve">(no false RED); refused IL CUB mirror dropped; corrections item C-05 brought up to date (Arizona documents, ERCOT, New Mexico, NYISO, Texas courts); §3 file and watch-list counts corrected</w:t>
             </w:r>
           </w:p>
         </w:tc>

</xml_diff>

<commit_message>
collector schedule: three nightly triggers with a skip guard, checkout newest main, last_full_run and gap tracking; Sweep/Brief report COLLECTOR_GAP
GitHub started the 2026-10-04 06:17 UTC scheduled run at 12:26 UTC (scheduled events are best-effort).

Co-Authored-By: Claude Opus 5.5 <noreply@anthropic.com>
Claude-Session: https://claude.ai/code/session_01NwD8Daam3i7DiEPPbN7b9E
</commit_message>
<xml_diff>
--- a/docs/GRID_DOCKET_CONTEXT.docx
+++ b/docs/GRID_DOCKET_CONTEXT.docx
@@ -3669,23 +3669,167 @@
         <w:pStyle w:val="FirstParagraph"/>
       </w:pPr>
       <w:r>
-        <w:t xml:space="preserve">Nightly at</w:t>
-      </w:r>
-      <w:r>
-        <w:t xml:space="preserve"> </w:t>
-      </w:r>
-      <w:r>
-        <w:rPr>
-          <w:bCs/>
-          <w:b/>
-        </w:rPr>
-        <w:t xml:space="preserve">06:17 UTC</w:t>
-      </w:r>
-      <w:r>
-        <w:t xml:space="preserve"> </w:t>
-      </w:r>
-      <w:r>
-        <w:t xml:space="preserve">(~23:17 PT). Writes only to the repo’s</w:t>
+        <w:t xml:space="preserve">Nightly, with</w:t>
+      </w:r>
+      <w:r>
+        <w:t xml:space="preserve"> </w:t>
+      </w:r>
+      <w:r>
+        <w:rPr>
+          <w:bCs/>
+          <w:b/>
+        </w:rPr>
+        <w:t xml:space="preserve">three scheduled triggers — 04:43, 06:17 and 08:41 UTC</w:t>
+      </w:r>
+      <w:r>
+        <w:t xml:space="preserve"> </w:t>
+      </w:r>
+      <w:r>
+        <w:t xml:space="preserve">(21:43, 23:17 and 01:41 PDT). GitHub runs scheduled</w:t>
+      </w:r>
+      <w:r>
+        <w:t xml:space="preserve"> </w:t>
+      </w:r>
+      <w:r>
+        <w:t xml:space="preserve">events best-effort (its docs: they</w:t>
+      </w:r>
+      <w:r>
+        <w:t xml:space="preserve"> </w:t>
+      </w:r>
+      <w:r>
+        <w:t xml:space="preserve">“</w:t>
+      </w:r>
+      <w:r>
+        <w:t xml:space="preserve">can be delayed during periods of high loads</w:t>
+      </w:r>
+      <w:r>
+        <w:t xml:space="preserve">”</w:t>
+      </w:r>
+      <w:r>
+        <w:t xml:space="preserve"> </w:t>
+      </w:r>
+      <w:r>
+        <w:t xml:space="preserve">and some</w:t>
+      </w:r>
+      <w:r>
+        <w:t xml:space="preserve"> </w:t>
+      </w:r>
+      <w:r>
+        <w:t xml:space="preserve">“</w:t>
+      </w:r>
+      <w:r>
+        <w:t xml:space="preserve">may be dropped</w:t>
+      </w:r>
+      <w:r>
+        <w:t xml:space="preserve">”</w:t>
+      </w:r>
+      <w:r>
+        <w:t xml:space="preserve">; the 06:17</w:t>
+      </w:r>
+      <w:r>
+        <w:t xml:space="preserve"> </w:t>
+      </w:r>
+      <w:r>
+        <w:t xml:space="preserve">run of 4 Oct started at 12:26 UTC). A guard step lets only the first trigger that starts do the work: later triggers</w:t>
+      </w:r>
+      <w:r>
+        <w:t xml:space="preserve"> </w:t>
+      </w:r>
+      <w:r>
+        <w:t xml:space="preserve">skip if a complete run finished within 10 hours, so agencies still see one collection a night. Each job checks out</w:t>
+      </w:r>
+      <w:r>
+        <w:t xml:space="preserve"> </w:t>
+      </w:r>
+      <w:r>
+        <w:t xml:space="preserve">the newest</w:t>
+      </w:r>
+      <w:r>
+        <w:t xml:space="preserve"> </w:t>
+      </w:r>
+      <w:r>
+        <w:rPr>
+          <w:rStyle w:val="VerbatimChar"/>
+        </w:rPr>
+        <w:t xml:space="preserve">main</w:t>
+      </w:r>
+      <w:r>
+        <w:t xml:space="preserve"> </w:t>
+      </w:r>
+      <w:r>
+        <w:t xml:space="preserve">at start (a queued event otherwise checks out an hours-old commit). Every complete run records</w:t>
+      </w:r>
+      <w:r>
+        <w:t xml:space="preserve"> </w:t>
+      </w:r>
+      <w:r>
+        <w:rPr>
+          <w:rStyle w:val="VerbatimChar"/>
+        </w:rPr>
+        <w:t xml:space="preserve">last_full_run</w:t>
+      </w:r>
+      <w:r>
+        <w:t xml:space="preserve"> </w:t>
+      </w:r>
+      <w:r>
+        <w:t xml:space="preserve">in</w:t>
+      </w:r>
+      <w:r>
+        <w:t xml:space="preserve"> </w:t>
+      </w:r>
+      <w:r>
+        <w:rPr>
+          <w:rStyle w:val="VerbatimChar"/>
+        </w:rPr>
+        <w:t xml:space="preserve">data/state/collector_state.json</w:t>
+      </w:r>
+      <w:r>
+        <w:t xml:space="preserve"> </w:t>
+      </w:r>
+      <w:r>
+        <w:t xml:space="preserve">and</w:t>
+      </w:r>
+      <w:r>
+        <w:t xml:space="preserve"> </w:t>
+      </w:r>
+      <w:r>
+        <w:rPr>
+          <w:rStyle w:val="VerbatimChar"/>
+        </w:rPr>
+        <w:t xml:space="preserve">hours_since_previous_full_run</w:t>
+      </w:r>
+      <w:r>
+        <w:t xml:space="preserve"> </w:t>
+      </w:r>
+      <w:r>
+        <w:t xml:space="preserve">/</w:t>
+      </w:r>
+      <w:r>
+        <w:t xml:space="preserve"> </w:t>
+      </w:r>
+      <w:r>
+        <w:rPr>
+          <w:rStyle w:val="VerbatimChar"/>
+        </w:rPr>
+        <w:t xml:space="preserve">collector_gap</w:t>
+      </w:r>
+      <w:r>
+        <w:t xml:space="preserve"> </w:t>
+      </w:r>
+      <w:r>
+        <w:t xml:space="preserve">in its</w:t>
+      </w:r>
+      <w:r>
+        <w:t xml:space="preserve"> </w:t>
+      </w:r>
+      <w:r>
+        <w:t xml:space="preserve">health file; the Sweep reports a gap as COLLECTOR_GAP (amber). A missed night loses nothing: adapters re-read from</w:t>
+      </w:r>
+      <w:r>
+        <w:t xml:space="preserve"> </w:t>
+      </w:r>
+      <w:r>
+        <w:t xml:space="preserve">their last success minus three days. Writes only to the repo’s</w:t>
       </w:r>
       <w:r>
         <w:t xml:space="preserve"> </w:t>
@@ -18152,6 +18296,61 @@
           <w:bCs/>
           <w:b/>
         </w:rPr>
+        <w:t xml:space="preserve">GitHub’s scheduler is best-effort.</w:t>
+      </w:r>
+      <w:r>
+        <w:t xml:space="preserve"> </w:t>
+      </w:r>
+      <w:r>
+        <w:t xml:space="preserve">A scheduled run can start hours late or never; one trigger is not a</w:t>
+      </w:r>
+      <w:r>
+        <w:t xml:space="preserve"> </w:t>
+      </w:r>
+      <w:r>
+        <w:t xml:space="preserve">schedule. Use several off-the-hour triggers with a guard so only one does the work, and check out</w:t>
+      </w:r>
+      <w:r>
+        <w:t xml:space="preserve"> </w:t>
+      </w:r>
+      <w:r>
+        <w:rPr>
+          <w:rStyle w:val="VerbatimChar"/>
+        </w:rPr>
+        <w:t xml:space="preserve">main</w:t>
+      </w:r>
+      <w:r>
+        <w:t xml:space="preserve"> </w:t>
+      </w:r>
+      <w:r>
+        <w:t xml:space="preserve">at job</w:t>
+      </w:r>
+      <w:r>
+        <w:t xml:space="preserve"> </w:t>
+      </w:r>
+      <w:r>
+        <w:t xml:space="preserve">start. (4 Oct: the 06:17 UTC run started at 12:26 and was first misreported here as skipped — check the run list</w:t>
+      </w:r>
+      <w:r>
+        <w:t xml:space="preserve"> </w:t>
+      </w:r>
+      <w:r>
+        <w:t xml:space="preserve">again before calling a run missed.)</w:t>
+      </w:r>
+    </w:p>
+    <w:p>
+      <w:pPr>
+        <w:numPr>
+          <w:ilvl w:val="0"/>
+          <w:numId w:val="1006"/>
+        </w:numPr>
+        <w:pStyle w:val="Compact"/>
+      </w:pPr>
+      <w:r>
+        <w:rPr>
+          <w:bCs/>
+          <w:b/>
+        </w:rPr>
         <w:t xml:space="preserve">The manual pass depends on Rett being present.</w:t>
       </w:r>
       <w:r>
@@ -18465,6 +18664,59 @@
             </w:r>
             <w:r>
               <w:t xml:space="preserve">(no false RED); refused IL CUB mirror dropped; corrections item C-05 brought up to date (Arizona documents, ERCOT, New Mexico, NYISO, Texas courts); §3 file and watch-list counts corrected</w:t>
+            </w:r>
+          </w:p>
+        </w:tc>
+      </w:tr>
+      <w:tr>
+        <w:tc>
+          <w:tcPr/>
+          <w:p>
+            <w:pPr>
+              <w:pStyle w:val="Compact"/>
+              <w:jc w:val="left"/>
+            </w:pPr>
+            <w:r>
+              <w:t xml:space="preserve">2026-10-04 (pm)</w:t>
+            </w:r>
+          </w:p>
+        </w:tc>
+        <w:tc>
+          <w:tcPr/>
+          <w:p>
+            <w:pPr>
+              <w:pStyle w:val="Compact"/>
+              <w:jc w:val="left"/>
+            </w:pPr>
+            <w:r>
+              <w:t xml:space="preserve">Collector schedule hardened after GitHub started the 4 Oct run six hours late: three nightly triggers (04:43, 06:17, 08:41 UTC) with a skip guard, checkout of the newest</w:t>
+            </w:r>
+            <w:r>
+              <w:t xml:space="preserve"> </w:t>
+            </w:r>
+            <w:r>
+              <w:rPr>
+                <w:rStyle w:val="VerbatimChar"/>
+              </w:rPr>
+              <w:t xml:space="preserve">main</w:t>
+            </w:r>
+            <w:r>
+              <w:t xml:space="preserve">,</w:t>
+            </w:r>
+            <w:r>
+              <w:t xml:space="preserve"> </w:t>
+            </w:r>
+            <w:r>
+              <w:rPr>
+                <w:rStyle w:val="VerbatimChar"/>
+              </w:rPr>
+              <w:t xml:space="preserve">last_full_run</w:t>
+            </w:r>
+            <w:r>
+              <w:t xml:space="preserve"> </w:t>
+            </w:r>
+            <w:r>
+              <w:t xml:space="preserve">and gap tracking; Sweep reports COLLECTOR_GAP, Brief treats it as amber</w:t>
             </w:r>
           </w:p>
         </w:tc>

</xml_diff>

<commit_message>
Context doc: store_manifest.json seed upload pending (SharePoint read-only)
Co-Authored-By: Claude Opus 5.5 <noreply@anthropic.com>
Claude-Session: https://claude.ai/code/session_019cSZrtYJ4BxCgZkcuxVGhW
</commit_message>
<xml_diff>
--- a/docs/GRID_DOCKET_CONTEXT.docx
+++ b/docs/GRID_DOCKET_CONTEXT.docx
@@ -1837,16 +1837,25 @@
               <w:t xml:space="preserve">”</w:t>
             </w:r>
             <w:r>
-              <w:t xml:space="preserve">). First written 13 Oct (</w:t>
-            </w:r>
-            <w:r>
-              <w:rPr>
-                <w:rStyle w:val="VerbatimChar"/>
-              </w:rPr>
-              <w:t xml:space="preserve">by: seed-2026-10-13-interactive</w:t>
-            </w:r>
-            <w:r>
-              <w:t xml:space="preserve">).</w:t>
+              <w:t xml:space="preserve">). The 13 Oct seed upload hit SharePoint</w:t>
+            </w:r>
+            <w:r>
+              <w:t xml:space="preserve"> </w:t>
+            </w:r>
+            <w:r>
+              <w:t xml:space="preserve">“</w:t>
+            </w:r>
+            <w:r>
+              <w:t xml:space="preserve">Database Is Read Only</w:t>
+            </w:r>
+            <w:r>
+              <w:t xml:space="preserve">”</w:t>
+            </w:r>
+            <w:r>
+              <w:t xml:space="preserve"> </w:t>
+            </w:r>
+            <w:r>
+              <w:t xml:space="preserve">(HTTP 403 serviceReadOnly) and is being retried; until a manifest exists, loaders check the mirror against the listing sizes only, and the 19 Oct Sweep writes the first one at 9.5 in any case.</w:t>
             </w:r>
           </w:p>
         </w:tc>

</xml_diff>

<commit_message>
store_sync: parse run-together folder listings; store_manifest.json seeded on OneDrive
Co-Authored-By: Claude Opus 5.5 <noreply@anthropic.com>
Claude-Session: https://claude.ai/code/session_019cSZrtYJ4BxCgZkcuxVGhW
</commit_message>
<xml_diff>
--- a/docs/GRID_DOCKET_CONTEXT.docx
+++ b/docs/GRID_DOCKET_CONTEXT.docx
@@ -1837,10 +1837,16 @@
               <w:t xml:space="preserve">”</w:t>
             </w:r>
             <w:r>
-              <w:t xml:space="preserve">). The 13 Oct seed upload hit SharePoint</w:t>
-            </w:r>
-            <w:r>
-              <w:t xml:space="preserve"> </w:t>
+              <w:t xml:space="preserve">). Seeded 13 Oct (</w:t>
+            </w:r>
+            <w:r>
+              <w:rPr>
+                <w:rStyle w:val="VerbatimChar"/>
+              </w:rPr>
+              <w:t xml:space="preserve">by: seed-2026-10-13-interactive</w:t>
+            </w:r>
+            <w:r>
+              <w:t xml:space="preserve">, 2,024 bytes) after SharePoint refused writes for about an hour that afternoon (</w:t>
             </w:r>
             <w:r>
               <w:t xml:space="preserve">“</w:t>
@@ -1852,10 +1858,7 @@
               <w:t xml:space="preserve">”</w:t>
             </w:r>
             <w:r>
-              <w:t xml:space="preserve"> </w:t>
-            </w:r>
-            <w:r>
-              <w:t xml:space="preserve">(HTTP 403 serviceReadOnly) and is being retried; until a manifest exists, loaders check the mirror against the listing sizes only, and the 19 Oct Sweep writes the first one at 9.5 in any case.</w:t>
+              <w:t xml:space="preserve">, HTTP 403 serviceReadOnly). The listing parser also learned that the connector sometimes prints folder entries run together on one line.</w:t>
             </w:r>
           </w:p>
         </w:tc>

</xml_diff>